<commit_message>
Template: date as placeholder instead of static text
</commit_message>
<xml_diff>
--- a/install_template.docx
+++ b/install_template.docx
@@ -3805,42 +3805,42 @@
           <w:u w:val="single"/>
           <w:lang w:val="uk-UA"/>
         </w:rPr>
-        <w:t>17</w:t>
+        <w:t>{{DATE}}</w:t>
       </w:r>
       <w:r>
         <w:rPr>
           <w:u w:val="single"/>
           <w:lang w:val="uk-UA"/>
         </w:rPr>
-        <w:t>.</w:t>
+        <w:t/>
       </w:r>
       <w:r>
         <w:rPr>
           <w:u w:val="single"/>
           <w:lang w:val="en-US"/>
         </w:rPr>
-        <w:t>0</w:t>
+        <w:t/>
       </w:r>
       <w:r>
         <w:rPr>
           <w:u w:val="single"/>
           <w:lang w:val="uk-UA"/>
         </w:rPr>
-        <w:t>8</w:t>
+        <w:t/>
       </w:r>
       <w:r>
         <w:rPr>
           <w:u w:val="single"/>
           <w:lang w:val="uk-UA"/>
         </w:rPr>
-        <w:t>.202</w:t>
+        <w:t/>
       </w:r>
       <w:r>
         <w:rPr>
           <w:u w:val="single"/>
           <w:lang w:val="en-US"/>
         </w:rPr>
-        <w:t>6</w:t>
+        <w:t/>
       </w:r>
       <w:r>
         <w:rPr>

</xml_diff>